<commit_message>
IAC on website setup on CentOS using VM provisioning
</commit_message>
<xml_diff>
--- a/wordpress-setup-vagrant-ubuntu/LAMP setup on Ubuntu VM using Vagrant.docx
+++ b/wordpress-setup-vagrant-ubuntu/LAMP setup on Ubuntu VM using Vagrant.docx
@@ -224,7 +224,13 @@
         </w:numPr>
       </w:pPr>
       <w:r>
-        <w:t>Save and quit. Turn up the VM</w:t>
+        <w:t xml:space="preserve">Save and quit. </w:t>
+      </w:r>
+      <w:r>
+        <w:t>Start</w:t>
+      </w:r>
+      <w:r>
+        <w:t xml:space="preserve"> the VM</w:t>
       </w:r>
     </w:p>
     <w:p>
@@ -1138,6 +1144,9 @@
     </w:p>
     <w:p>
       <w:r>
+        <w:rPr>
+          <w:noProof/>
+        </w:rPr>
         <w:drawing>
           <wp:inline distT="0" distB="0" distL="0" distR="0" wp14:anchorId="72B91109" wp14:editId="40CF7431">
             <wp:extent cx="3520745" cy="739204"/>
@@ -1189,6 +1198,9 @@
     </w:p>
     <w:p>
       <w:r>
+        <w:rPr>
+          <w:noProof/>
+        </w:rPr>
         <w:drawing>
           <wp:inline distT="0" distB="0" distL="0" distR="0" wp14:anchorId="6E211A28" wp14:editId="06F55949">
             <wp:extent cx="3558848" cy="662997"/>
@@ -1238,6 +1250,9 @@
         <w:t>reload apache2 to apply all these changes</w:t>
       </w:r>
       <w:r>
+        <w:rPr>
+          <w:noProof/>
+        </w:rPr>
         <w:drawing>
           <wp:inline distT="0" distB="0" distL="0" distR="0" wp14:anchorId="008CF16D" wp14:editId="3A168F08">
             <wp:extent cx="3177815" cy="289585"/>
@@ -1289,6 +1304,9 @@
     </w:p>
     <w:p>
       <w:r>
+        <w:rPr>
+          <w:noProof/>
+        </w:rPr>
         <w:drawing>
           <wp:inline distT="0" distB="0" distL="0" distR="0" wp14:anchorId="0B18004F" wp14:editId="32D07D4A">
             <wp:extent cx="5532599" cy="662997"/>
@@ -1328,6 +1346,9 @@
     </w:p>
     <w:p>
       <w:r>
+        <w:rPr>
+          <w:noProof/>
+        </w:rPr>
         <w:drawing>
           <wp:inline distT="0" distB="0" distL="0" distR="0" wp14:anchorId="43C0CAA4" wp14:editId="562ACAC5">
             <wp:extent cx="4054191" cy="777307"/>
@@ -1385,6 +1406,9 @@
     </w:p>
     <w:p>
       <w:r>
+        <w:rPr>
+          <w:noProof/>
+        </w:rPr>
         <w:drawing>
           <wp:inline distT="0" distB="0" distL="0" distR="0" wp14:anchorId="135B16B2" wp14:editId="28826842">
             <wp:extent cx="5425910" cy="1836579"/>
@@ -1442,6 +1466,7 @@
       </w:pPr>
       <w:r>
         <w:rPr>
+          <w:noProof/>
           <w:lang w:val="en-US"/>
         </w:rPr>
         <w:lastRenderedPageBreak/>
@@ -1508,6 +1533,7 @@
       </w:pPr>
       <w:r>
         <w:rPr>
+          <w:noProof/>
           <w:lang w:val="en-US"/>
         </w:rPr>
         <w:drawing>
@@ -1573,6 +1599,7 @@
       </w:pPr>
       <w:r>
         <w:rPr>
+          <w:noProof/>
           <w:lang w:val="en-US"/>
         </w:rPr>
         <w:drawing>
@@ -1638,6 +1665,7 @@
       </w:pPr>
       <w:r>
         <w:rPr>
+          <w:noProof/>
           <w:lang w:val="en-US"/>
         </w:rPr>
         <w:drawing>
@@ -1722,6 +1750,7 @@
       </w:pPr>
       <w:r>
         <w:rPr>
+          <w:noProof/>
           <w:lang w:val="en-US"/>
         </w:rPr>
         <w:drawing>
@@ -1784,6 +1813,7 @@
       </w:pPr>
       <w:r>
         <w:rPr>
+          <w:noProof/>
           <w:lang w:val="en-US"/>
         </w:rPr>
         <w:drawing>
@@ -2082,6 +2112,7 @@
       </w:pPr>
       <w:r>
         <w:rPr>
+          <w:noProof/>
           <w:lang w:val="en-US"/>
         </w:rPr>
         <w:drawing>
@@ -2147,6 +2178,7 @@
       </w:pPr>
       <w:r>
         <w:rPr>
+          <w:noProof/>
           <w:lang w:val="en-US"/>
         </w:rPr>
         <w:lastRenderedPageBreak/>
@@ -2195,6 +2227,7 @@
       </w:pPr>
       <w:r>
         <w:rPr>
+          <w:noProof/>
           <w:lang w:val="en-US"/>
         </w:rPr>
         <w:drawing>
@@ -3035,6 +3068,7 @@
   <w:style w:type="character" w:default="1" w:styleId="DefaultParagraphFont">
     <w:name w:val="Default Paragraph Font"/>
     <w:uiPriority w:val="1"/>
+    <w:semiHidden/>
     <w:unhideWhenUsed/>
   </w:style>
   <w:style w:type="table" w:default="1" w:styleId="TableNormal">

</xml_diff>